<commit_message>
Novo teste, isolando depêndencias no venv
</commit_message>
<xml_diff>
--- a/cartas_timbradas/TIMBRADA - (01) MOTORISTA.docx
+++ b/cartas_timbradas/TIMBRADA - (01) MOTORISTA.docx
@@ -1024,7 +1024,7 @@
                                 <w:sz w:val="28"/>
                                 <w:szCs w:val="28"/>
                               </w:rPr>
-                              <w:t xml:space="preserve">J&amp;C Gestão de Riscos </w:t>
+                              <w:t xml:space="preserve">JC Gestão de Riscos </w:t>
                             </w:r>
                             <w:r>
                               <w:rPr>
@@ -1171,7 +1171,7 @@
                           <w:sz w:val="28"/>
                           <w:szCs w:val="28"/>
                         </w:rPr>
-                        <w:t xml:space="preserve">J&amp;C Gestão de Riscos </w:t>
+                        <w:t xml:space="preserve">JC Gestão de Riscos </w:t>
                       </w:r>
                       <w:r>
                         <w:rPr>
@@ -3709,30 +3709,6 @@
 </file>
 
 <file path=customXml/item1.xml><?xml version="1.0" encoding="utf-8"?>
-<?mso-contentType ?>
-<FormTemplates xmlns="http://schemas.microsoft.com/sharepoint/v3/contenttype/forms">
-  <Display>DocumentLibraryForm</Display>
-  <Edit>DocumentLibraryForm</Edit>
-  <New>DocumentLibraryForm</New>
-</FormTemplates>
-</file>
-
-<file path=customXml/item2.xml><?xml version="1.0" encoding="utf-8"?>
-<b:Sources xmlns:b="http://schemas.openxmlformats.org/officeDocument/2006/bibliography" xmlns="http://schemas.openxmlformats.org/officeDocument/2006/bibliography" SelectedStyle="/APASixthEditionOfficeOnline.xsl" StyleName="APA" Version="6"/>
-</file>
-
-<file path=customXml/item3.xml><?xml version="1.0" encoding="utf-8"?>
-<p:properties xmlns:p="http://schemas.microsoft.com/office/2006/metadata/properties" xmlns:xsi="http://www.w3.org/2001/XMLSchema-instance" xmlns:pc="http://schemas.microsoft.com/office/infopath/2007/PartnerControls">
-  <documentManagement>
-    <lcf76f155ced4ddcb4097134ff3c332f xmlns="caef4c4a-035d-4ffb-bcaa-d117ff00202a">
-      <Terms xmlns="http://schemas.microsoft.com/office/infopath/2007/PartnerControls"/>
-    </lcf76f155ced4ddcb4097134ff3c332f>
-    <TaxCatchAll xmlns="1ea0291b-196e-49d1-95e6-84c7fa1b9a06" xsi:nil="true"/>
-  </documentManagement>
-</p:properties>
-</file>
-
-<file path=customXml/item4.xml><?xml version="1.0" encoding="utf-8"?>
 <ct:contentTypeSchema xmlns:ct="http://schemas.microsoft.com/office/2006/metadata/contentType" xmlns:ma="http://schemas.microsoft.com/office/2006/metadata/properties/metaAttributes" ct:_="" ma:_="" ma:contentTypeName="Documento" ma:contentTypeID="0x0101000F89E8D46E8A114BAECD566DFB523DAC" ma:contentTypeVersion="10" ma:contentTypeDescription="Crie um novo documento." ma:contentTypeScope="" ma:versionID="c5889e6cf4f064f02a88c18e47ab8976">
   <xsd:schema xmlns:xsd="http://www.w3.org/2001/XMLSchema" xmlns:xs="http://www.w3.org/2001/XMLSchema" xmlns:p="http://schemas.microsoft.com/office/2006/metadata/properties" xmlns:ns2="caef4c4a-035d-4ffb-bcaa-d117ff00202a" xmlns:ns3="1ea0291b-196e-49d1-95e6-84c7fa1b9a06" targetNamespace="http://schemas.microsoft.com/office/2006/metadata/properties" ma:root="true" ma:fieldsID="a956e2795b0dd2ba3baedc3c92cc041f" ns2:_="" ns3:_="">
     <xsd:import namespace="caef4c4a-035d-4ffb-bcaa-d117ff00202a"/>
@@ -3921,34 +3897,31 @@
 </ct:contentTypeSchema>
 </file>
 
-<file path=customXml/itemProps1.xml><?xml version="1.0" encoding="utf-8"?>
-<ds:datastoreItem xmlns:ds="http://schemas.openxmlformats.org/officeDocument/2006/customXml" ds:itemID="{186F9346-AA61-4EE4-80BF-758BFE8BFB14}">
-  <ds:schemaRefs>
-    <ds:schemaRef ds:uri="http://schemas.microsoft.com/sharepoint/v3/contenttype/forms"/>
-  </ds:schemaRefs>
-</ds:datastoreItem>
+<file path=customXml/item2.xml><?xml version="1.0" encoding="utf-8"?>
+<p:properties xmlns:p="http://schemas.microsoft.com/office/2006/metadata/properties" xmlns:xsi="http://www.w3.org/2001/XMLSchema-instance" xmlns:pc="http://schemas.microsoft.com/office/infopath/2007/PartnerControls">
+  <documentManagement>
+    <lcf76f155ced4ddcb4097134ff3c332f xmlns="caef4c4a-035d-4ffb-bcaa-d117ff00202a">
+      <Terms xmlns="http://schemas.microsoft.com/office/infopath/2007/PartnerControls"/>
+    </lcf76f155ced4ddcb4097134ff3c332f>
+    <TaxCatchAll xmlns="1ea0291b-196e-49d1-95e6-84c7fa1b9a06" xsi:nil="true"/>
+  </documentManagement>
+</p:properties>
 </file>
 
-<file path=customXml/itemProps2.xml><?xml version="1.0" encoding="utf-8"?>
-<ds:datastoreItem xmlns:ds="http://schemas.openxmlformats.org/officeDocument/2006/customXml" ds:itemID="{4CCDD1C5-0C3B-8849-ABDA-BB66B30E841C}">
-  <ds:schemaRefs>
-    <ds:schemaRef ds:uri="http://schemas.openxmlformats.org/officeDocument/2006/bibliography"/>
-  </ds:schemaRefs>
-</ds:datastoreItem>
+<file path=customXml/item3.xml><?xml version="1.0" encoding="utf-8"?>
+<b:Sources xmlns:b="http://schemas.openxmlformats.org/officeDocument/2006/bibliography" xmlns="http://schemas.openxmlformats.org/officeDocument/2006/bibliography" SelectedStyle="/APASixthEditionOfficeOnline.xsl" StyleName="APA" Version="6"/>
 </file>
 
-<file path=customXml/itemProps3.xml><?xml version="1.0" encoding="utf-8"?>
-<ds:datastoreItem xmlns:ds="http://schemas.openxmlformats.org/officeDocument/2006/customXml" ds:itemID="{B2357DAC-D783-4A27-B966-D2891FF9940C}">
-  <ds:schemaRefs>
-    <ds:schemaRef ds:uri="http://schemas.microsoft.com/office/2006/metadata/properties"/>
-    <ds:schemaRef ds:uri="http://schemas.microsoft.com/office/infopath/2007/PartnerControls"/>
-    <ds:schemaRef ds:uri="caef4c4a-035d-4ffb-bcaa-d117ff00202a"/>
-    <ds:schemaRef ds:uri="1ea0291b-196e-49d1-95e6-84c7fa1b9a06"/>
-  </ds:schemaRefs>
-</ds:datastoreItem>
+<file path=customXml/item4.xml><?xml version="1.0" encoding="utf-8"?>
+<?mso-contentType ?>
+<FormTemplates xmlns="http://schemas.microsoft.com/sharepoint/v3/contenttype/forms">
+  <Display>DocumentLibraryForm</Display>
+  <Edit>DocumentLibraryForm</Edit>
+  <New>DocumentLibraryForm</New>
+</FormTemplates>
 </file>
 
-<file path=customXml/itemProps4.xml><?xml version="1.0" encoding="utf-8"?>
+<file path=customXml/itemProps1.xml><?xml version="1.0" encoding="utf-8"?>
 <ds:datastoreItem xmlns:ds="http://schemas.openxmlformats.org/officeDocument/2006/customXml" ds:itemID="{28C9B355-9C06-4CD6-8E3A-2A7A252136D1}">
   <ds:schemaRefs>
     <ds:schemaRef ds:uri="http://schemas.microsoft.com/office/2006/metadata/contentType"/>
@@ -3965,4 +3938,31 @@
     <ds:schemaRef ds:uri="http://schemas.microsoft.com/internal/obd"/>
   </ds:schemaRefs>
 </ds:datastoreItem>
+</file>
+
+<file path=customXml/itemProps2.xml><?xml version="1.0" encoding="utf-8"?>
+<ds:datastoreItem xmlns:ds="http://schemas.openxmlformats.org/officeDocument/2006/customXml" ds:itemID="{B2357DAC-D783-4A27-B966-D2891FF9940C}">
+  <ds:schemaRefs>
+    <ds:schemaRef ds:uri="http://schemas.microsoft.com/office/2006/metadata/properties"/>
+    <ds:schemaRef ds:uri="http://schemas.microsoft.com/office/infopath/2007/PartnerControls"/>
+    <ds:schemaRef ds:uri="caef4c4a-035d-4ffb-bcaa-d117ff00202a"/>
+    <ds:schemaRef ds:uri="1ea0291b-196e-49d1-95e6-84c7fa1b9a06"/>
+  </ds:schemaRefs>
+</ds:datastoreItem>
+</file>
+
+<file path=customXml/itemProps3.xml><?xml version="1.0" encoding="utf-8"?>
+<ds:datastoreItem xmlns:ds="http://schemas.openxmlformats.org/officeDocument/2006/customXml" ds:itemID="{4CCDD1C5-0C3B-8849-ABDA-BB66B30E841C}">
+  <ds:schemaRefs>
+    <ds:schemaRef ds:uri="http://schemas.openxmlformats.org/officeDocument/2006/bibliography"/>
+  </ds:schemaRefs>
+</ds:datastoreItem>
+</file>
+
+<file path=customXml/itemProps4.xml><?xml version="1.0" encoding="utf-8"?>
+<ds:datastoreItem xmlns:ds="http://schemas.openxmlformats.org/officeDocument/2006/customXml" ds:itemID="{186F9346-AA61-4EE4-80BF-758BFE8BFB14}">
+  <ds:schemaRefs>
+    <ds:schemaRef ds:uri="http://schemas.microsoft.com/sharepoint/v3/contenttype/forms"/>
+  </ds:schemaRefs>
+</ds:datastoreItem>
 </file>
</xml_diff>